<commit_message>
docs(report): regenerate benchmark-backed briefs
</commit_message>
<xml_diff>
--- a/docs/value-add-report/Janasunani_2.0_IAS_Officer_Brief_August_2026.docx
+++ b/docs/value-add-report/Janasunani_2.0_IAS_Officer_Brief_August_2026.docx
@@ -88,7 +88,7 @@
                 <w:color w:val="138782"/>
                 <w:sz w:val="44"/>
               </w:rPr>
-              <w:t>4.4 seconds</w:t>
+              <w:t>0.13 seconds</w:t>
             </w:r>
           </w:p>
           <w:p>
@@ -102,7 +102,7 @@
                 <w:color w:val="112E51"/>
                 <w:sz w:val="19"/>
               </w:rPr>
-              <w:t>Warm typed grievance prepared by the pipeline</w:t>
+              <w:t>Warm typed grievance p50; PDF p50 13.66 s</w:t>
             </w:r>
           </w:p>
         </w:tc>
@@ -130,7 +130,7 @@
                 <w:color w:val="112E51"/>
                 <w:sz w:val="44"/>
               </w:rPr>
-              <w:t>69 in 100</w:t>
+              <w:t>69%</w:t>
             </w:r>
           </w:p>
           <w:p>
@@ -919,7 +919,7 @@
                 <w:color w:val="112E51"/>
                 <w:sz w:val="19"/>
               </w:rPr>
-              <w:t>Routing: 45.15% top-1 and 69.05% top-3 on 208,267 later cases; 54.96% / 79.68% where the intake category is informative.</w:t>
+              <w:t>Routing: 45.14% top-1 and 69.04% top-3 on 208,267 later cases; 54.96% / 79.68% where intake category is informative.</w:t>
             </w:r>
           </w:p>
         </w:tc>
@@ -1258,7 +1258,7 @@
           <w:color w:val="526175"/>
           <w:sz w:val="20"/>
         </w:rPr>
-        <w:t>Two practical findings stand out. First, the canonical frontier-adjudicated binary development test caught all 13 complaints needing extra review, while also sending 3 of 44 ordinary complaints to review; it is not compatible with the five-class serving slot and produced no deployable artifact. Second, category plus district places the later historical destination in the top three for 69.05% of cases, rising to 79.68% where the intake category is informative. Both need a newly frozen, officer-reviewed release set.</w:t>
+        <w:t>Two practical findings stand out. First, the tracked frontier-adjudicated binary development test caught 13/13 complaints needing extra review, while also sending 3/44 ordinary complaints to review; it is not compatible with the five-class serving slot. Second, category plus district places the later historical destination in the top three for 69.04% of cases, rising to 79.68% where the intake category is informative. Both need a newly frozen, officer-reviewed release set.</w:t>
       </w:r>
     </w:p>
     <w:tbl>
@@ -1311,7 +1311,7 @@
                 <w:color w:val="112E51"/>
                 <w:sz w:val="21"/>
               </w:rPr>
-              <w:t>The pipeline is ready for end-to-end verification and a shadow test of whether it can reduce search and reading burden. We have not yet measured officer minutes saved, correct legal authority, faster resolution, or citizen satisfaction. Those claims require exposure logging, adjudication and a locked rollout.</w:t>
+              <w:t>The tracked development run completed 90/90 synthetic attempts with 0 failures. Impact remains unmeasured (0/2 required impact artifacts available): no officer minutes saved, correct legal authority, faster resolution, or citizen satisfaction effect is claimed. Those claims require exposure logging, adjudication and a locked rollout.</w:t>
             </w:r>
           </w:p>
         </w:tc>
@@ -1948,7 +1948,7 @@
           <w:color w:val="526175"/>
           <w:sz w:val="17"/>
         </w:rPr>
-        <w:t>Source note: figures are drawn from the August 2026 value-add report, the chronological routing benchmark, the actionability weak-label audit and frontier-development aggregate, the Sambalpur/2024 dedup review slice and cached Sarvam evidence. Full definitions and reproduction limits remain in the long report and docs/QUALITY_BENCHMARKS.md.</w:t>
+        <w:t>Source note: benchmark-backed figures come from full bundle c713c41ecd97b256c42b63022c75e6ccfc2cc45fa6152c95aa812a1de47dcc47. Dedup and descriptive administrative findings retain their separate cited sources. Full definitions and reproduction limits remain in the long report and docs/QUALITY_BENCHMARKS.md.</w:t>
       </w:r>
     </w:p>
     <w:sectPr>

</xml_diff>

<commit_message>
docs(report): refresh governed pipeline-quality evidence
Refresh the long value-add report, the concise IAS brief, and the reusable public-systems capability brief from the governed bundle. Present category and summary results as development evidence, preserve release and impact blockers, correct routing rounding, and make long tables repeat their headers across pages.

Verification: all three DOCX archives pass unzip -t and all 21 rendered pages were visually inspected.

Tests: uv run --extra serving --extra pipeline-core pytest (1605 passed, 18 skipped)

Tests: uv run ruff check .
</commit_message>
<xml_diff>
--- a/docs/value-add-report/Janasunani_2.0_IAS_Officer_Brief_August_2026.docx
+++ b/docs/value-add-report/Janasunani_2.0_IAS_Officer_Brief_August_2026.docx
@@ -658,7 +658,7 @@
                 <w:color w:val="112E51"/>
                 <w:sz w:val="21"/>
               </w:rPr>
-              <w:t>An abusive or content-free sentence is marked low-signal, its language is left unknown, and category and summary are skipped. The evaluation taxonomy keeps an incomplete request separate from irrelevant, outside-purview and policy-blocked cases; no compatible five-class serving model is active yet. This fixes the screenshot failure without pretending all four cases are ‘spam’.</w:t>
+              <w:t>An abusive or content-free sentence is marked low-signal, its language is left unknown, and category and summary are skipped. The evaluation taxonomy keeps an incomplete request separate from irrelevant, outside-purview and policy-blocked cases. A checksummed binary model can now serve the advisory review decision, but it does not invent a five-class reason and is not approved for release. This fixes the screenshot failure without pretending all four cases are ‘spam’.</w:t>
             </w:r>
           </w:p>
         </w:tc>
@@ -1008,6 +1008,184 @@
                 <w:color w:val="112E51"/>
                 <w:sz w:val="19"/>
               </w:rPr>
+              <w:t>Category shortlist: 46.55% top-1 and 90.89% top-3 historical-label agreement on a viewed 2024 test of 3,160 later cases.</w:t>
+            </w:r>
+          </w:p>
+        </w:tc>
+        <w:tc>
+          <w:tcPr>
+            <w:tcW w:type="dxa" w:w="3000"/>
+            <w:shd w:fill="F8FAFC"/>
+            <w:vAlign w:val="center"/>
+            <w:tcMar>
+              <w:top w:w="120" w:type="dxa"/>
+              <w:start w:w="140" w:type="dxa"/>
+              <w:bottom w:w="120" w:type="dxa"/>
+              <w:end w:w="140" w:type="dxa"/>
+            </w:tcMar>
+          </w:tcPr>
+          <w:p>
+            <w:pPr>
+              <w:spacing w:after="0" w:line="252" w:lineRule="auto"/>
+            </w:pPr>
+            <w:r/>
+            <w:r>
+              <w:rPr>
+                <w:rFonts w:ascii="Aptos" w:hAnsi="Aptos"/>
+                <w:b w:val="0"/>
+                <w:color w:val="112E51"/>
+                <w:sz w:val="19"/>
+              </w:rPr>
+              <w:t>The local candidate can often place the recorded category in a short officer-review list.</w:t>
+            </w:r>
+          </w:p>
+        </w:tc>
+        <w:tc>
+          <w:tcPr>
+            <w:tcW w:type="dxa" w:w="3835"/>
+            <w:shd w:fill="F8FAFC"/>
+            <w:vAlign w:val="center"/>
+            <w:tcMar>
+              <w:top w:w="120" w:type="dxa"/>
+              <w:start w:w="140" w:type="dxa"/>
+              <w:bottom w:w="120" w:type="dxa"/>
+              <w:end w:w="140" w:type="dxa"/>
+            </w:tcMar>
+          </w:tcPr>
+          <w:p>
+            <w:pPr>
+              <w:spacing w:after="0" w:line="252" w:lineRule="auto"/>
+            </w:pPr>
+            <w:r/>
+            <w:r>
+              <w:rPr>
+                <w:rFonts w:ascii="Aptos" w:hAnsi="Aptos"/>
+                <w:b w:val="0"/>
+                <w:color w:val="112E51"/>
+                <w:sz w:val="19"/>
+              </w:rPr>
+              <w:t>The split prevents exact-text leakage, but the result is not policy correctness or release evidence and must not auto-assign a case.</w:t>
+            </w:r>
+          </w:p>
+        </w:tc>
+      </w:tr>
+      <w:tr>
+        <w:trPr>
+          <w:cantSplit/>
+        </w:trPr>
+        <w:tc>
+          <w:tcPr>
+            <w:tcW w:type="dxa" w:w="3200"/>
+            <w:shd w:fill="EDF3F9"/>
+            <w:vAlign w:val="center"/>
+            <w:tcMar>
+              <w:top w:w="120" w:type="dxa"/>
+              <w:start w:w="140" w:type="dxa"/>
+              <w:bottom w:w="120" w:type="dxa"/>
+              <w:end w:w="140" w:type="dxa"/>
+            </w:tcMar>
+          </w:tcPr>
+          <w:p>
+            <w:pPr>
+              <w:spacing w:after="0" w:line="252" w:lineRule="auto"/>
+            </w:pPr>
+            <w:r/>
+            <w:r>
+              <w:rPr>
+                <w:rFonts w:ascii="Aptos" w:hAnsi="Aptos"/>
+                <w:b w:val="0"/>
+                <w:color w:val="112E51"/>
+                <w:sz w:val="19"/>
+              </w:rPr>
+              <w:t>Summary baseline: 55/84 critical facts retained; 8/26 drafts usable without edit.</w:t>
+            </w:r>
+          </w:p>
+        </w:tc>
+        <w:tc>
+          <w:tcPr>
+            <w:tcW w:type="dxa" w:w="3000"/>
+            <w:shd w:fill="EDF3F9"/>
+            <w:vAlign w:val="center"/>
+            <w:tcMar>
+              <w:top w:w="120" w:type="dxa"/>
+              <w:start w:w="140" w:type="dxa"/>
+              <w:bottom w:w="120" w:type="dxa"/>
+              <w:end w:w="140" w:type="dxa"/>
+            </w:tcMar>
+          </w:tcPr>
+          <w:p>
+            <w:pPr>
+              <w:spacing w:after="0" w:line="252" w:lineRule="auto"/>
+            </w:pPr>
+            <w:r/>
+            <w:r>
+              <w:rPr>
+                <w:rFonts w:ascii="Aptos" w:hAnsi="Aptos"/>
+                <w:b w:val="0"/>
+                <w:color w:val="112E51"/>
+                <w:sz w:val="19"/>
+              </w:rPr>
+              <w:t>The local model was conservative about invention: the single judge found no unsupported or contradictory generated case.</w:t>
+            </w:r>
+          </w:p>
+        </w:tc>
+        <w:tc>
+          <w:tcPr>
+            <w:tcW w:type="dxa" w:w="3835"/>
+            <w:shd w:fill="EDF3F9"/>
+            <w:vAlign w:val="center"/>
+            <w:tcMar>
+              <w:top w:w="120" w:type="dxa"/>
+              <w:start w:w="140" w:type="dxa"/>
+              <w:bottom w:w="120" w:type="dxa"/>
+              <w:end w:w="140" w:type="dxa"/>
+            </w:tcMar>
+          </w:tcPr>
+          <w:p>
+            <w:pPr>
+              <w:spacing w:after="0" w:line="252" w:lineRule="auto"/>
+            </w:pPr>
+            <w:r/>
+            <w:r>
+              <w:rPr>
+                <w:rFonts w:ascii="Aptos" w:hAnsi="Aptos"/>
+                <w:b w:val="0"/>
+                <w:color w:val="112E51"/>
+                <w:sz w:val="19"/>
+              </w:rPr>
+              <w:t>It repeated residual identifying detail in 4/26 drafts and failed the vague-input/Odia skip cases; officer validation is still required.</w:t>
+            </w:r>
+          </w:p>
+        </w:tc>
+      </w:tr>
+      <w:tr>
+        <w:trPr>
+          <w:cantSplit/>
+        </w:trPr>
+        <w:tc>
+          <w:tcPr>
+            <w:tcW w:type="dxa" w:w="3200"/>
+            <w:shd w:fill="F8FAFC"/>
+            <w:vAlign w:val="center"/>
+            <w:tcMar>
+              <w:top w:w="120" w:type="dxa"/>
+              <w:start w:w="140" w:type="dxa"/>
+              <w:bottom w:w="120" w:type="dxa"/>
+              <w:end w:w="140" w:type="dxa"/>
+            </w:tcMar>
+          </w:tcPr>
+          <w:p>
+            <w:pPr>
+              <w:spacing w:after="0" w:line="252" w:lineRule="auto"/>
+            </w:pPr>
+            <w:r/>
+            <w:r>
+              <w:rPr>
+                <w:rFonts w:ascii="Aptos" w:hAnsi="Aptos"/>
+                <w:b w:val="0"/>
+                <w:color w:val="112E51"/>
+                <w:sz w:val="19"/>
+              </w:rPr>
               <w:t>Low-signal taxonomy: 106,683 non-conflicting administrative weak labels across underspecified, irrelevant, outside-purview and policy cases.</w:t>
             </w:r>
           </w:p>
@@ -1258,7 +1436,7 @@
           <w:color w:val="526175"/>
           <w:sz w:val="20"/>
         </w:rPr>
-        <w:t>Two practical findings stand out. First, the tracked frontier-adjudicated binary development test caught 13/13 complaints needing extra review, while also sending 3/44 ordinary complaints to review; it is not compatible with the five-class serving slot. Second, category plus district places the later historical destination in the top three for 69.04% of cases, rising to 79.68% where the intake category is informative. Both need a newly frozen, officer-reviewed release set.</w:t>
+        <w:t>Four practical findings stand out. First, the tracked frontier-adjudicated binary development test caught 13/13 complaints needing extra review, while also sending 3/44 ordinary complaints to review. Its checksummed binary artifact can serve that advisory review decision, but does not assign five-class reasons and is not release-eligible. Second, a separate chronological category model placed the recorded category in its top three for 90.89% of a viewed 2024 development test (n=3,160), with 46.55% top-1 and 36.49% macro-F1; this is historical-label agreement, not policy correctness. Third, the local BART baseline retained 55/84 critical facts and produced 8/26 drafts usable without edit; privacy and skip failures make it a repair baseline. Fourth, category plus district places the later historical destination in the top three for 69.04% of cases, rising to 79.68% where the intake category is informative. All need a newly frozen, officer-reviewed release set.</w:t>
       </w:r>
     </w:p>
     <w:tbl>
@@ -1948,7 +2126,7 @@
           <w:color w:val="526175"/>
           <w:sz w:val="17"/>
         </w:rPr>
-        <w:t>Source note: benchmark-backed figures come from full bundle c713c41ecd97b256c42b63022c75e6ccfc2cc45fa6152c95aa812a1de47dcc47. Dedup and descriptive administrative findings retain their separate cited sources. Full definitions and reproduction limits remain in the long report and docs/QUALITY_BENCHMARKS.md.</w:t>
+        <w:t>Source note: benchmark-backed figures come from full bundle 9b18d0fa2de7a69c2c7ee8c2ee9fc7c8a0f0f6d4b026230b0633fb1fa21b83a1. Dedup and descriptive administrative findings retain their separate cited sources. Full definitions and reproduction limits remain in the long report and docs/QUALITY_BENCHMARKS.md.</w:t>
       </w:r>
     </w:p>
     <w:sectPr>

</xml_diff>